<commit_message>
Landing: cut collaborators, drop raw-vs-vetted framing, add student research path
Per Kevin's feedback. Docx explainer/handoff regenerated to match.

Co-Authored-By: Claude Fable 5 <noreply@anthropic.com>
</commit_message>
<xml_diff>
--- a/AI Opportunity Inventory - Handoff for Kevin.docx
+++ b/AI Opportunity Inventory - Handoff for Kevin.docx
@@ -96,7 +96,7 @@
         <w:t xml:space="preserve">The front door. </w:t>
       </w:r>
       <w:r>
-        <w:t>A landing page that tells the initiative's story — the three-step process, the collaborators, and a “Join” button that goes to your interest form.</w:t>
+        <w:t>A landing page that tells the initiative's story — the process, the student research path, and a “Join” button that goes to your interest form.</w:t>
       </w:r>
     </w:p>
     <w:p>
@@ -218,7 +218,7 @@
           <w:i w:val="0"/>
           <w:sz w:val="22"/>
         </w:rPr>
-        <w:t>Right now the site runs on sample data — a snapshot of the real bank — because connecting it to your Google account requires steps on your side. None are hard, and the fiddliest one can be a 20-minute screen share where Mark drives.</w:t>
+        <w:t>For the pilot, the whole system runs on Mark's accounts — including his copy of the tracker sheet and a pilot member list with the two of us on it. Everything works end to end today. The steps below are what moves it onto YOUR accounts and YOUR real sign-up list, whenever you're ready. None are hard, and the fiddliest one can be a 20-minute screen share where Mark drives — he has now done it once on his own account, so it's a well-worn path.</w:t>
       </w:r>
     </w:p>
     <w:p>

</xml_diff>